<commit_message>
8-partiya: 71–80-mavzular; 'madaniy' -> 'kultural' (057, 060, 061, 065, 070)
</commit_message>
<xml_diff>
--- a/Мавзу2/057.docx
+++ b/Мавзу2/057.docx
@@ -41,7 +41,7 @@
           <w:b w:val="0"/>
           <w:sz w:val="28"/>
         </w:rPr>
-        <w:t>Stafilokokklar yiringli-yallig'lanish kasalliklarining eng ko'p uchraydigan qo'zg'atuvchilari qatoriga kiradi. Ularni birinchi bo'lib 1880-yilda L. Pasteur aniqlagan, A. Ogston (1882) va F. Rozenbax (1884) esa chuqur o'rgangan [1]. Hozirgi kunda yiringli-yallig'lanish va jarohat infeksiyalari qo'zg'atuvchilari jarrohlik, akusherlik-ginekologiya, pediatriya va boshqa bo'limlarda ko'p uchraydi, ko'pincha kasalxona ichida tarqalib, gospital infeksiya xarakteriga ega bo'ladi [2]. Stafilokokklarning morfologik, madaniy va biokimyoviy xossalarini bilish laborantga tashxis uchun to'g'ri kultura ajratish va identifikatsiya qilish imkonini beradi.</w:t>
+        <w:t>Stafilokokklar yiringli-yallig'lanish kasalliklarining eng ko'p uchraydigan qo'zg'atuvchilari qatoriga kiradi. Ularni birinchi bo'lib 1880-yilda L. Pasteur aniqlagan, A. Ogston (1882) va F. Rozenbax (1884) esa chuqur o'rgangan [1]. Hozirgi kunda yiringli-yallig'lanish va jarohat infeksiyalari qo'zg'atuvchilari jarrohlik, akusherlik-ginekologiya, pediatriya va boshqa bo'limlarda ko'p uchraydi, ko'pincha kasalxona ichida tarqalib, gospital infeksiya xarakteriga ega bo'ladi [2]. Stafilokokklarning morfologik, kultural va biokimyoviy xossalarini bilish laborantga tashxis uchun to'g'ri kultura ajratish va identifikatsiya qilish imkonini beradi.</w:t>
       </w:r>
     </w:p>
     <w:p>
@@ -110,7 +110,7 @@
           <w:b/>
           <w:sz w:val="28"/>
         </w:rPr>
-        <w:t>Madaniy xossalari</w:t>
+        <w:t>Kultural xossalari</w:t>
       </w:r>
     </w:p>
     <w:p>

</xml_diff>